<commit_message>
Add safe video and learning publishing
</commit_message>
<xml_diff>
--- a/docs/member-guide-ja.docx
+++ b/docs/member-guide-ja.docx
@@ -1436,7 +1436,7 @@
           <w:color w:val="0B2545"/>
           <w:sz w:val="22"/>
         </w:rPr>
-        <w:t>このコマンドは、`export/260712_01/260712_01.mp4` を次の共有用フォルダへコピーします。</w:t>
+        <w:t>このコマンドは、`export/260712_01/260712_01.mp4` を次の「完了動画共有フォルダ」へコピーします。</w:t>
       </w:r>
     </w:p>
     <w:p>
@@ -1611,7 +1611,7 @@
           <w:color w:val="0B2545"/>
           <w:sz w:val="22"/>
         </w:rPr>
-        <w:t>commit、push、PR 作成も動画作成スキルだけでは自動実行されません。Codex に「`shared-videos/&lt;project-id&gt;/` だけを commit し、個人ブランチへ push して PR を作成してください」と頼めます。GitHub のログイン画面や実行許可が出たときは本人が承認します。</w:t>
+        <w:t>完成動画の共有は、次のコマンド1つで行えます。`shared-videos/&lt;project-id&gt;/` だけを commit・push し、ほかのファイルや `leran_rule/` は公開しません。</w:t>
       </w:r>
     </w:p>
     <w:p>
@@ -1625,13 +1625,7 @@
           <w:color w:val="0B2545"/>
           <w:sz w:val="18"/>
         </w:rPr>
-        <w:t>git status</w:t>
-        <w:br/>
-        <w:t>git add shared-videos/260712_01</w:t>
-        <w:br/>
-        <w:t>git commit -m "share: 260712_01"</w:t>
-        <w:br/>
-        <w:t>git push -u origin video/260712_01</w:t>
+        <w:t>npm.cmd run codex:push-video -- 260712_01</w:t>
       </w:r>
     </w:p>
     <w:p>
@@ -2189,7 +2183,7 @@
           <w:color w:val="0B2545"/>
           <w:sz w:val="22"/>
         </w:rPr>
-        <w:t>`shared-videos/&lt;project-id&gt;/` だけをコミットした</w:t>
+        <w:t>`npm.cmd run codex:push-video -- &lt;project-id&gt;` を実行した</w:t>
       </w:r>
     </w:p>
     <w:p>

</xml_diff>

<commit_message>
Auto-share video after final approval
</commit_message>
<xml_diff>
--- a/docs/member-guide-ja.docx
+++ b/docs/member-guide-ja.docx
@@ -410,7 +410,7 @@
                 <w:color w:val="0B2545"/>
                 <w:sz w:val="19"/>
               </w:rPr>
-              <w:t>いいえ</w:t>
+              <w:t>はい。完成 MP4 の `OK` 後に自動で行います。</w:t>
             </w:r>
           </w:p>
         </w:tc>
@@ -428,7 +428,7 @@
                 <w:color w:val="0B2545"/>
                 <w:sz w:val="19"/>
               </w:rPr>
-              <w:t>`codex:share` の実行を頼めば実行できます。</w:t>
+              <w:t>project ID を指定して頼む必要はありません。</w:t>
             </w:r>
           </w:p>
         </w:tc>
@@ -466,7 +466,7 @@
                 <w:color w:val="0B2545"/>
                 <w:sz w:val="19"/>
               </w:rPr>
-              <w:t>いいえ</w:t>
+              <w:t>はい。完成 MP4 の `OK` 後に自動で行います。</w:t>
             </w:r>
           </w:p>
         </w:tc>
@@ -484,7 +484,7 @@
                 <w:color w:val="0B2545"/>
                 <w:sz w:val="19"/>
               </w:rPr>
-              <w:t>明示して頼めば実行できます。ログインと最終確認は本人が行います。</w:t>
+              <w:t>GitHub のログインや実行許可だけは本人が承認します。</w:t>
             </w:r>
           </w:p>
         </w:tc>
@@ -1198,7 +1198,7 @@
           <w:color w:val="0B2545"/>
           <w:sz w:val="21"/>
         </w:rPr>
-        <w:t>MP4 を描画して、共有用 MP4 を準備する</w:t>
+        <w:t>MP4 を描画して確認し、最後の OK で共有する</w:t>
       </w:r>
     </w:p>
     <w:p>
@@ -1235,7 +1235,7 @@
           <w:color w:val="0B2545"/>
           <w:sz w:val="21"/>
         </w:rPr>
-        <w:t>個人ブランチから PR を作成し、オーナー確認を待つ</w:t>
+        <w:t>Codex が個人ブランチへ push・PR 作成し、オーナー確認を待つ</w:t>
       </w:r>
     </w:p>
     <w:p>
@@ -1320,7 +1320,24 @@
           <w:color w:val="0B2545"/>
           <w:sz w:val="22"/>
         </w:rPr>
-        <w:t>描画後に、1920×1080、30fps、無音の H.264 MP4 が作成されます。</w:t>
+        <w:t>描画後に、1920×1080、30fps、無音の H.264 MP4 が作成されます。完成動画を確認し、問題なければもう一度 `OK` と返します。</w:t>
+      </w:r>
+    </w:p>
+    <w:p>
+      <w:pPr>
+        <w:spacing w:after="80"/>
+        <w:numPr>
+          <w:ilvl w:val="0"/>
+          <w:numId w:val="93"/>
+        </w:numPr>
+      </w:pPr>
+      <w:r>
+        <w:rPr>
+          <w:rFonts w:ascii="Calibri" w:hAnsi="Calibri" w:eastAsia="Yu Gothic"/>
+          <w:color w:val="0B2545"/>
+          <w:sz w:val="22"/>
+        </w:rPr>
+        <w:t>この最後の `OK` の後、Codex が共有用 MP4 の準備、個人ブランチへの push、ドラフト PR の作成まで自動で行います。</w:t>
       </w:r>
     </w:p>
     <w:tbl>
@@ -1383,7 +1400,7 @@
         <w:keepNext/>
       </w:pPr>
       <w:r>
-        <w:t>5. 共有用 MP4 を準備する</w:t>
+        <w:t>5. 完成動画の `OK` で GitHub に共有する</w:t>
       </w:r>
     </w:p>
     <w:p>
@@ -1396,7 +1413,7 @@
           <w:color w:val="0B2545"/>
           <w:sz w:val="22"/>
         </w:rPr>
-        <w:t>描画が完了したら、動画の project ID を指定して共有用ファイルを作ります。</w:t>
+        <w:t>描画後に完成 MP4 を確認します。問題なければ `OK` と返すだけで、共有用ファイルの準備から GitHub への push、ドラフト PR の作成まで進みます。project ID を書いた追加メッセージは不要です。</w:t>
       </w:r>
     </w:p>
     <w:p>
@@ -1409,34 +1426,7 @@
           <w:color w:val="0B2545"/>
           <w:sz w:val="22"/>
         </w:rPr>
-        <w:t>この処理は描画完了後に自動では実行されません。Codex に「project ID は `&lt;project-id&gt;` です。共有用 MP4 を準備してください。まだ commit と push はしないでください」と頼むか、次を実行します。</w:t>
-      </w:r>
-    </w:p>
-    <w:p>
-      <w:pPr>
-        <w:pStyle w:val="GuideCode"/>
-        <w:ind w:left="259" w:right="259"/>
-      </w:pPr>
-      <w:r>
-        <w:rPr>
-          <w:rFonts w:ascii="Consolas" w:hAnsi="Consolas" w:eastAsia="Yu Gothic"/>
-          <w:color w:val="0B2545"/>
-          <w:sz w:val="18"/>
-        </w:rPr>
-        <w:t>npm.cmd run codex:share -- 260712_01</w:t>
-      </w:r>
-    </w:p>
-    <w:p>
-      <w:pPr>
-        <w:spacing w:after="120"/>
-      </w:pPr>
-      <w:r>
-        <w:rPr>
-          <w:rFonts w:ascii="Calibri" w:hAnsi="Calibri" w:eastAsia="Yu Gothic"/>
-          <w:color w:val="0B2545"/>
-          <w:sz w:val="22"/>
-        </w:rPr>
-        <w:t>このコマンドは、`export/260712_01/260712_01.mp4` を次の「完了動画共有フォルダ」へコピーします。</w:t>
+        <w:t>この処理は、`export/260712_01/260712_01.mp4` を次の「完了動画共有フォルダ」へコピーします。</w:t>
       </w:r>
     </w:p>
     <w:p>
@@ -1585,7 +1575,7 @@
         <w:keepNext/>
       </w:pPr>
       <w:r>
-        <w:t>6. GitHub に共有する</w:t>
+        <w:t>6. GitHub の認証だけ本人が行う</w:t>
       </w:r>
     </w:p>
     <w:p>
@@ -1598,7 +1588,7 @@
           <w:color w:val="0B2545"/>
           <w:sz w:val="22"/>
         </w:rPr>
-        <w:t>共有用フォルダだけをコミットし、個人ブランチへ push します。</w:t>
+        <w:t>最後の `OK` の後、Codex は `shared-videos/&lt;project-id&gt;/` だけを commit・push し、ドラフト PR を作成します。ほかのファイルや `leran_rule/` は公開しません。</w:t>
       </w:r>
     </w:p>
     <w:p>
@@ -1611,85 +1601,7 @@
           <w:color w:val="0B2545"/>
           <w:sz w:val="22"/>
         </w:rPr>
-        <w:t>完成動画の共有は、次のコマンド1つで行えます。`shared-videos/&lt;project-id&gt;/` だけを commit・push し、ほかのファイルや `leran_rule/` は公開しません。</w:t>
-      </w:r>
-    </w:p>
-    <w:p>
-      <w:pPr>
-        <w:pStyle w:val="GuideCode"/>
-        <w:ind w:left="259" w:right="259"/>
-      </w:pPr>
-      <w:r>
-        <w:rPr>
-          <w:rFonts w:ascii="Consolas" w:hAnsi="Consolas" w:eastAsia="Yu Gothic"/>
-          <w:color w:val="0B2545"/>
-          <w:sz w:val="18"/>
-        </w:rPr>
-        <w:t>npm.cmd run codex:push-video -- 260712_01</w:t>
-      </w:r>
-    </w:p>
-    <w:p>
-      <w:pPr>
-        <w:spacing w:after="120"/>
-      </w:pPr>
-      <w:r>
-        <w:rPr>
-          <w:rFonts w:ascii="Calibri" w:hAnsi="Calibri" w:eastAsia="Yu Gothic"/>
-          <w:color w:val="0B2545"/>
-          <w:sz w:val="22"/>
-        </w:rPr>
-        <w:t>GitHub でリポジトリを開き、**Compare &amp; pull request** を選びます。PR には次を記載します。</w:t>
-      </w:r>
-    </w:p>
-    <w:p>
-      <w:pPr>
-        <w:spacing w:after="80"/>
-        <w:numPr>
-          <w:ilvl w:val="0"/>
-          <w:numId w:val="96"/>
-        </w:numPr>
-      </w:pPr>
-      <w:r>
-        <w:rPr>
-          <w:rFonts w:ascii="Calibri" w:hAnsi="Calibri" w:eastAsia="Yu Gothic"/>
-          <w:color w:val="0B2545"/>
-          <w:sz w:val="22"/>
-        </w:rPr>
-        <w:t>作成した動画の目的</w:t>
-      </w:r>
-    </w:p>
-    <w:p>
-      <w:pPr>
-        <w:spacing w:after="80"/>
-        <w:numPr>
-          <w:ilvl w:val="0"/>
-          <w:numId w:val="96"/>
-        </w:numPr>
-      </w:pPr>
-      <w:r>
-        <w:rPr>
-          <w:rFonts w:ascii="Calibri" w:hAnsi="Calibri" w:eastAsia="Yu Gothic"/>
-          <w:color w:val="0B2545"/>
-          <w:sz w:val="22"/>
-        </w:rPr>
-        <w:t>project ID</w:t>
-      </w:r>
-    </w:p>
-    <w:p>
-      <w:pPr>
-        <w:spacing w:after="80"/>
-        <w:numPr>
-          <w:ilvl w:val="0"/>
-          <w:numId w:val="96"/>
-        </w:numPr>
-      </w:pPr>
-      <w:r>
-        <w:rPr>
-          <w:rFonts w:ascii="Calibri" w:hAnsi="Calibri" w:eastAsia="Yu Gothic"/>
-          <w:color w:val="0B2545"/>
-          <w:sz w:val="22"/>
-        </w:rPr>
-        <w:t>`review-request.md` を確認してほしい場合は、その旨</w:t>
+        <w:t>GitHub のログイン画面や実行許可が表示されたときだけ、本人が承認します。作成後、Codex が PR のリンクを表示します。</w:t>
       </w:r>
     </w:p>
     <w:p>
@@ -2160,7 +2072,7 @@
           <w:color w:val="0B2545"/>
           <w:sz w:val="22"/>
         </w:rPr>
-        <w:t>`npm.cmd run codex:share -- &lt;project-id&gt;` を実行した</w:t>
+        <w:t>完成 MP4 を確認し、問題ないことを示す最後の `OK` を返した</w:t>
       </w:r>
     </w:p>
     <w:p>
@@ -2183,7 +2095,7 @@
           <w:color w:val="0B2545"/>
           <w:sz w:val="22"/>
         </w:rPr>
-        <w:t>`npm.cmd run codex:push-video -- &lt;project-id&gt;` を実行した</w:t>
+        <w:t>`shared-videos/&lt;project-id&gt;/` だけが自動で共有された</w:t>
       </w:r>
     </w:p>
     <w:p>
@@ -2269,7 +2181,7 @@
         <w:spacing w:after="80"/>
         <w:numPr>
           <w:ilvl w:val="0"/>
-          <w:numId w:val="97"/>
+          <w:numId w:val="96"/>
         </w:numPr>
       </w:pPr>
       <w:r>
@@ -2286,7 +2198,7 @@
         <w:spacing w:after="80"/>
         <w:numPr>
           <w:ilvl w:val="0"/>
-          <w:numId w:val="97"/>
+          <w:numId w:val="96"/>
         </w:numPr>
       </w:pPr>
       <w:r>
@@ -2656,24 +2568,6 @@
   </w:abstractNum>
   <w:num w:numId="96">
     <w:abstractNumId w:val="96"/>
-  </w:num>
-  <w:abstractNum w:abstractNumId="97">
-    <w:multiLevelType w:val="singleLevel"/>
-    <w:lvl w:ilvl="0">
-      <w:start w:val="1"/>
-      <w:numFmt w:val="bullet"/>
-      <w:lvlText w:val="•"/>
-      <w:lvlJc w:val="left"/>
-      <w:pPr>
-        <w:tabs>
-          <w:tab w:val="num" w:pos="540"/>
-        </w:tabs>
-        <w:ind w:left="540" w:hanging="270"/>
-      </w:pPr>
-    </w:lvl>
-  </w:abstractNum>
-  <w:num w:numId="97">
-    <w:abstractNumId w:val="97"/>
   </w:num>
 </w:numbering>
 </file>

</xml_diff>

<commit_message>
Add adaptive animation workflow
</commit_message>
<xml_diff>
--- a/docs/member-guide-ja.docx
+++ b/docs/member-guide-ja.docx
@@ -71,6 +71,9 @@
         <w:gridCol w:w="9360"/>
       </w:tblGrid>
       <w:tr>
+        <w:trPr>
+          <w:cantSplit/>
+        </w:trPr>
         <w:tc>
           <w:tcPr>
             <w:tcW w:type="dxa" w:w="9360"/>
@@ -102,7 +105,7 @@
                 <w:color w:val="0B2545"/>
                 <w:sz w:val="21"/>
               </w:rPr>
-              <w:t>このリポジトリでは、メンバーは `leran_rule/` を作成・編集・承認しません。改善点は共有動画の `review-request.md` に事実と意図だけを記録し、ルール化はオーナーが手動で行います。</w:t>
+              <w:t>このリポジトリでは、メンバーは `leran_rule/` を作成・編集・承認しません。改善点は共有動画の `review-request.md` に事実と意図だけを記録します。動画をオーナーが承認した後、Codex が学習案を提示し、オーナーが明示的に承認した内容だけを正式ルールにします。</w:t>
             </w:r>
           </w:p>
         </w:tc>
@@ -112,6 +115,11 @@
       <w:pPr>
         <w:spacing w:after="0"/>
       </w:pPr>
+    </w:p>
+    <w:p>
+      <w:r>
+        <w:br w:type="page"/>
+      </w:r>
     </w:p>
     <w:p>
       <w:pPr>
@@ -136,6 +144,9 @@
         <w:gridCol w:w="3630"/>
       </w:tblGrid>
       <w:tr>
+        <w:trPr>
+          <w:cantSplit/>
+        </w:trPr>
         <w:tc>
           <w:tcPr>
             <w:tcW w:type="dxa" w:w="2100"/>
@@ -149,6 +160,9 @@
             <w:shd w:fill="E8EEF5"/>
           </w:tcPr>
           <w:p>
+            <w:pPr>
+              <w:keepNext/>
+            </w:pPr>
             <w:r>
               <w:rPr>
                 <w:rFonts w:ascii="Calibri" w:hAnsi="Calibri" w:eastAsia="Yu Gothic"/>
@@ -173,6 +187,9 @@
             <w:shd w:fill="E8EEF5"/>
           </w:tcPr>
           <w:p>
+            <w:pPr>
+              <w:keepNext/>
+            </w:pPr>
             <w:r>
               <w:rPr>
                 <w:rFonts w:ascii="Calibri" w:hAnsi="Calibri" w:eastAsia="Yu Gothic"/>
@@ -197,6 +214,9 @@
             <w:shd w:fill="E8EEF5"/>
           </w:tcPr>
           <w:p>
+            <w:pPr>
+              <w:keepNext/>
+            </w:pPr>
             <w:r>
               <w:rPr>
                 <w:rFonts w:ascii="Calibri" w:hAnsi="Calibri" w:eastAsia="Yu Gothic"/>
@@ -210,12 +230,16 @@
         </w:tc>
       </w:tr>
       <w:tr>
+        <w:trPr>
+          <w:cantSplit/>
+        </w:trPr>
         <w:tc>
           <w:tcPr>
             <w:tcW w:type="dxa" w:w="2100"/>
           </w:tcPr>
           <w:p>
             <w:pPr>
+              <w:keepNext/>
               <w:spacing w:after="0"/>
             </w:pPr>
             <w:r>
@@ -234,6 +258,7 @@
           </w:tcPr>
           <w:p>
             <w:pPr>
+              <w:keepNext/>
               <w:spacing w:after="0"/>
             </w:pPr>
             <w:r>
@@ -252,6 +277,7 @@
           </w:tcPr>
           <w:p>
             <w:pPr>
+              <w:keepNext/>
               <w:spacing w:after="0"/>
             </w:pPr>
             <w:r>
@@ -266,12 +292,16 @@
         </w:tc>
       </w:tr>
       <w:tr>
+        <w:trPr>
+          <w:cantSplit/>
+        </w:trPr>
         <w:tc>
           <w:tcPr>
             <w:tcW w:type="dxa" w:w="2100"/>
           </w:tcPr>
           <w:p>
             <w:pPr>
+              <w:keepNext/>
               <w:spacing w:after="0"/>
             </w:pPr>
             <w:r>
@@ -290,6 +320,7 @@
           </w:tcPr>
           <w:p>
             <w:pPr>
+              <w:keepNext/>
               <w:spacing w:after="0"/>
             </w:pPr>
             <w:r>
@@ -308,6 +339,7 @@
           </w:tcPr>
           <w:p>
             <w:pPr>
+              <w:keepNext/>
               <w:spacing w:after="0"/>
             </w:pPr>
             <w:r>
@@ -322,12 +354,16 @@
         </w:tc>
       </w:tr>
       <w:tr>
+        <w:trPr>
+          <w:cantSplit/>
+        </w:trPr>
         <w:tc>
           <w:tcPr>
             <w:tcW w:type="dxa" w:w="2100"/>
           </w:tcPr>
           <w:p>
             <w:pPr>
+              <w:keepNext/>
               <w:spacing w:after="0"/>
             </w:pPr>
             <w:r>
@@ -346,6 +382,7 @@
           </w:tcPr>
           <w:p>
             <w:pPr>
+              <w:keepNext/>
               <w:spacing w:after="0"/>
             </w:pPr>
             <w:r>
@@ -354,7 +391,7 @@
                 <w:color w:val="0B2545"/>
                 <w:sz w:val="19"/>
               </w:rPr>
-              <w:t>はい。ただし各確認で `OK` が必要です。</w:t>
+              <w:t>はい。固定パターンを選ばず、台本の意味に合わせて動きを組み合わせます。</w:t>
             </w:r>
           </w:p>
         </w:tc>
@@ -364,6 +401,7 @@
           </w:tcPr>
           <w:p>
             <w:pPr>
+              <w:keepNext/>
               <w:spacing w:after="0"/>
             </w:pPr>
             <w:r>
@@ -372,18 +410,22 @@
                 <w:color w:val="0B2545"/>
                 <w:sz w:val="19"/>
               </w:rPr>
-              <w:t>構図の希望は台本の次に書いて渡します。</w:t>
+              <w:t>構図の希望は台本の次に書き、日本語のタイムラインを確認します。</w:t>
             </w:r>
           </w:p>
         </w:tc>
       </w:tr>
       <w:tr>
+        <w:trPr>
+          <w:cantSplit/>
+        </w:trPr>
         <w:tc>
           <w:tcPr>
             <w:tcW w:type="dxa" w:w="2100"/>
           </w:tcPr>
           <w:p>
             <w:pPr>
+              <w:keepNext/>
               <w:spacing w:after="0"/>
             </w:pPr>
             <w:r>
@@ -402,6 +444,7 @@
           </w:tcPr>
           <w:p>
             <w:pPr>
+              <w:keepNext/>
               <w:spacing w:after="0"/>
             </w:pPr>
             <w:r>
@@ -420,6 +463,7 @@
           </w:tcPr>
           <w:p>
             <w:pPr>
+              <w:keepNext/>
               <w:spacing w:after="0"/>
             </w:pPr>
             <w:r>
@@ -434,6 +478,9 @@
         </w:tc>
       </w:tr>
       <w:tr>
+        <w:trPr>
+          <w:cantSplit/>
+        </w:trPr>
         <w:tc>
           <w:tcPr>
             <w:tcW w:type="dxa" w:w="2100"/>
@@ -496,11 +543,6 @@
       </w:pPr>
     </w:p>
     <w:p>
-      <w:r>
-        <w:br w:type="page"/>
-      </w:r>
-    </w:p>
-    <w:p>
       <w:pPr>
         <w:pStyle w:val="Heading1"/>
         <w:keepNext/>
@@ -511,6 +553,7 @@
     </w:p>
     <w:p>
       <w:pPr>
+        <w:keepNext/>
         <w:spacing w:after="80"/>
         <w:numPr>
           <w:ilvl w:val="0"/>
@@ -528,6 +571,7 @@
     </w:p>
     <w:p>
       <w:pPr>
+        <w:keepNext/>
         <w:spacing w:after="80"/>
         <w:numPr>
           <w:ilvl w:val="0"/>
@@ -540,11 +584,30 @@
           <w:color w:val="0B2545"/>
           <w:sz w:val="22"/>
         </w:rPr>
-        <w:t>作成途中の画像、構造、アニメーションを確認し、それぞれ問題なければ `OK` と返します。</w:t>
+        <w:t>作成途中の画像、構造、日本語で説明されたアニメーションの流れを確認し、それぞれ問題なければ `OK` と返します。</w:t>
       </w:r>
     </w:p>
     <w:p>
       <w:pPr>
+        <w:keepNext/>
+        <w:spacing w:after="80"/>
+        <w:numPr>
+          <w:ilvl w:val="0"/>
+          <w:numId w:val="91"/>
+        </w:numPr>
+      </w:pPr>
+      <w:r>
+        <w:rPr>
+          <w:rFonts w:ascii="Calibri" w:hAnsi="Calibri" w:eastAsia="Yu Gothic"/>
+          <w:color w:val="0B2545"/>
+          <w:sz w:val="22"/>
+        </w:rPr>
+        <w:t>アニメーションは、移動・拡大・回転・透明度・線の描画・緩急を台本に合わせて毎回組み合わせます。</w:t>
+      </w:r>
+    </w:p>
+    <w:p>
+      <w:pPr>
+        <w:keepNext w:val="0"/>
         <w:spacing w:after="80"/>
         <w:numPr>
           <w:ilvl w:val="0"/>
@@ -574,6 +637,9 @@
         <w:gridCol w:w="3630"/>
       </w:tblGrid>
       <w:tr>
+        <w:trPr>
+          <w:cantSplit/>
+        </w:trPr>
         <w:tc>
           <w:tcPr>
             <w:tcW w:type="dxa" w:w="2100"/>
@@ -587,6 +653,9 @@
             <w:shd w:fill="E8EEF5"/>
           </w:tcPr>
           <w:p>
+            <w:pPr>
+              <w:keepNext/>
+            </w:pPr>
             <w:r>
               <w:rPr>
                 <w:rFonts w:ascii="Calibri" w:hAnsi="Calibri" w:eastAsia="Yu Gothic"/>
@@ -611,6 +680,9 @@
             <w:shd w:fill="E8EEF5"/>
           </w:tcPr>
           <w:p>
+            <w:pPr>
+              <w:keepNext/>
+            </w:pPr>
             <w:r>
               <w:rPr>
                 <w:rFonts w:ascii="Calibri" w:hAnsi="Calibri" w:eastAsia="Yu Gothic"/>
@@ -635,6 +707,9 @@
             <w:shd w:fill="E8EEF5"/>
           </w:tcPr>
           <w:p>
+            <w:pPr>
+              <w:keepNext/>
+            </w:pPr>
             <w:r>
               <w:rPr>
                 <w:rFonts w:ascii="Calibri" w:hAnsi="Calibri" w:eastAsia="Yu Gothic"/>
@@ -648,12 +723,16 @@
         </w:tc>
       </w:tr>
       <w:tr>
+        <w:trPr>
+          <w:cantSplit/>
+        </w:trPr>
         <w:tc>
           <w:tcPr>
             <w:tcW w:type="dxa" w:w="2100"/>
           </w:tcPr>
           <w:p>
             <w:pPr>
+              <w:keepNext/>
               <w:spacing w:after="0"/>
             </w:pPr>
             <w:r>
@@ -672,6 +751,7 @@
           </w:tcPr>
           <w:p>
             <w:pPr>
+              <w:keepNext/>
               <w:spacing w:after="0"/>
             </w:pPr>
             <w:r>
@@ -690,6 +770,7 @@
           </w:tcPr>
           <w:p>
             <w:pPr>
+              <w:keepNext/>
               <w:spacing w:after="0"/>
             </w:pPr>
             <w:r>
@@ -704,6 +785,9 @@
         </w:tc>
       </w:tr>
       <w:tr>
+        <w:trPr>
+          <w:cantSplit/>
+        </w:trPr>
         <w:tc>
           <w:tcPr>
             <w:tcW w:type="dxa" w:w="2100"/>
@@ -736,7 +820,7 @@
                 <w:color w:val="0B2545"/>
                 <w:sz w:val="19"/>
               </w:rPr>
-              <w:t>メンバー招待、PR 確認、ルールの手動承認と更新</w:t>
+              <w:t>メンバー招待、PR 確認、動画承認後の学習案確認、ルールの明示承認と更新</w:t>
             </w:r>
           </w:p>
         </w:tc>
@@ -789,6 +873,7 @@
     </w:p>
     <w:p>
       <w:pPr>
+        <w:keepNext/>
         <w:spacing w:after="80"/>
         <w:numPr>
           <w:ilvl w:val="0"/>
@@ -806,6 +891,7 @@
     </w:p>
     <w:p>
       <w:pPr>
+        <w:keepNext/>
         <w:spacing w:after="80"/>
         <w:numPr>
           <w:ilvl w:val="0"/>
@@ -823,6 +909,7 @@
     </w:p>
     <w:p>
       <w:pPr>
+        <w:keepNext w:val="0"/>
         <w:spacing w:after="80"/>
         <w:numPr>
           <w:ilvl w:val="0"/>
@@ -841,6 +928,7 @@
     <w:p>
       <w:pPr>
         <w:pStyle w:val="GuideCode"/>
+        <w:keepLines/>
         <w:ind w:left="259" w:right="259"/>
       </w:pPr>
       <w:r>
@@ -870,6 +958,9 @@
         <w:gridCol w:w="9360"/>
       </w:tblGrid>
       <w:tr>
+        <w:trPr>
+          <w:cantSplit/>
+        </w:trPr>
         <w:tc>
           <w:tcPr>
             <w:tcW w:type="dxa" w:w="9360"/>
@@ -937,6 +1028,7 @@
     <w:p>
       <w:pPr>
         <w:pStyle w:val="GuideCode"/>
+        <w:keepLines/>
         <w:ind w:left="259" w:right="259"/>
       </w:pPr>
       <w:r>
@@ -1007,6 +1099,7 @@
     <w:p>
       <w:pPr>
         <w:pStyle w:val="GuideCode"/>
+        <w:keepLines/>
         <w:ind w:left="259" w:right="259"/>
       </w:pPr>
       <w:r>
@@ -1056,6 +1149,7 @@
     <w:p>
       <w:pPr>
         <w:pStyle w:val="GuideCode"/>
+        <w:keepLines/>
         <w:ind w:left="259" w:right="259"/>
       </w:pPr>
       <w:r>
@@ -1087,11 +1181,12 @@
           <w:color w:val="0B2545"/>
           <w:sz w:val="22"/>
         </w:rPr>
-        <w:t>構図の希望がない場合は、`構図・デザインの希望` の行を削除します。動画作成は次の流れです。</w:t>
+        <w:t>構図の希望がない場合は、`構図・デザインの希望` の行を削除します。Codex は承認済みルールをテンプレート一覧として選ぶのではなく、品質基準と参考例として使います。台本を意味のまとまりに分け、内容に合う移動・拡大・回転・透明度・線の描画・緩急を安全な範囲で毎回組み合わせます。動画作成は次の流れです。</w:t>
       </w:r>
     </w:p>
     <w:p>
       <w:pPr>
+        <w:keepNext/>
         <w:spacing w:before="80" w:after="80"/>
       </w:pPr>
       <w:r>
@@ -1106,6 +1201,7 @@
     </w:p>
     <w:p>
       <w:pPr>
+        <w:keepNext/>
         <w:spacing w:after="40"/>
         <w:ind w:left="547" w:hanging="274"/>
       </w:pPr>
@@ -1129,6 +1225,7 @@
     </w:p>
     <w:p>
       <w:pPr>
+        <w:keepNext/>
         <w:spacing w:after="40"/>
         <w:ind w:left="547"/>
       </w:pPr>
@@ -1143,6 +1240,7 @@
     </w:p>
     <w:p>
       <w:pPr>
+        <w:keepNext/>
         <w:spacing w:after="40"/>
         <w:ind w:left="547" w:hanging="274"/>
       </w:pPr>
@@ -1161,11 +1259,12 @@
           <w:color w:val="0B2545"/>
           <w:sz w:val="21"/>
         </w:rPr>
-        <w:t>画像・構造・アニメーションを確認し、必要な段階で OK を返す</w:t>
+        <w:t>画像・構造・日本語タイムラインを確認し、必要な段階で OK を返す</w:t>
       </w:r>
     </w:p>
     <w:p>
       <w:pPr>
+        <w:keepNext/>
         <w:spacing w:after="40"/>
         <w:ind w:left="547"/>
       </w:pPr>
@@ -1180,6 +1279,7 @@
     </w:p>
     <w:p>
       <w:pPr>
+        <w:keepNext/>
         <w:spacing w:after="40"/>
         <w:ind w:left="547" w:hanging="274"/>
       </w:pPr>
@@ -1203,6 +1303,7 @@
     </w:p>
     <w:p>
       <w:pPr>
+        <w:keepNext/>
         <w:spacing w:after="40"/>
         <w:ind w:left="547"/>
       </w:pPr>
@@ -1217,6 +1318,7 @@
     </w:p>
     <w:p>
       <w:pPr>
+        <w:keepNext/>
         <w:spacing w:after="40"/>
         <w:ind w:left="547" w:hanging="274"/>
       </w:pPr>
@@ -1240,6 +1342,46 @@
     </w:p>
     <w:p>
       <w:pPr>
+        <w:keepNext/>
+        <w:spacing w:after="40"/>
+        <w:ind w:left="547"/>
+      </w:pPr>
+      <w:r>
+        <w:rPr>
+          <w:rFonts w:ascii="Calibri" w:hAnsi="Calibri" w:eastAsia="Yu Gothic"/>
+          <w:color w:val="5F6B76"/>
+          <w:sz w:val="20"/>
+        </w:rPr>
+        <w:t>↓</w:t>
+      </w:r>
+    </w:p>
+    <w:p>
+      <w:pPr>
+        <w:keepNext w:val="0"/>
+        <w:spacing w:after="40"/>
+        <w:ind w:left="547" w:hanging="274"/>
+      </w:pPr>
+      <w:r>
+        <w:rPr>
+          <w:rFonts w:ascii="Calibri" w:hAnsi="Calibri" w:eastAsia="Yu Gothic"/>
+          <w:b/>
+          <w:color w:val="2E74B5"/>
+          <w:sz w:val="21"/>
+        </w:rPr>
+        <w:t xml:space="preserve">5. </w:t>
+      </w:r>
+      <w:r>
+        <w:rPr>
+          <w:rFonts w:ascii="Calibri" w:hAnsi="Calibri" w:eastAsia="Yu Gothic"/>
+          <w:color w:val="0B2545"/>
+          <w:sz w:val="21"/>
+        </w:rPr>
+        <w:t>オーナー承認後、Codex が学習案を提示し、承認された内容だけ反映する</w:t>
+      </w:r>
+    </w:p>
+    <w:p>
+      <w:pPr>
+        <w:keepNext/>
         <w:spacing w:after="80"/>
         <w:numPr>
           <w:ilvl w:val="0"/>
@@ -1257,6 +1399,7 @@
     </w:p>
     <w:p>
       <w:pPr>
+        <w:keepNext/>
         <w:spacing w:after="80"/>
         <w:numPr>
           <w:ilvl w:val="0"/>
@@ -1274,6 +1417,7 @@
     </w:p>
     <w:p>
       <w:pPr>
+        <w:keepNext/>
         <w:spacing w:after="80"/>
         <w:numPr>
           <w:ilvl w:val="0"/>
@@ -1286,11 +1430,12 @@
           <w:color w:val="0B2545"/>
           <w:sz w:val="22"/>
         </w:rPr>
-        <w:t>次に **構造**（タイトル、関係線、ノード、注釈の内容と順番）を確認します。</w:t>
+        <w:t>次に **構造**（タイトル、関係線、ノード、注釈の内容と順番）を確認します。新しい矢印や曲線には、それぞれの経路が設定されます。</w:t>
       </w:r>
     </w:p>
     <w:p>
       <w:pPr>
+        <w:keepNext/>
         <w:spacing w:after="80"/>
         <w:numPr>
           <w:ilvl w:val="0"/>
@@ -1303,11 +1448,12 @@
           <w:color w:val="0B2545"/>
           <w:sz w:val="22"/>
         </w:rPr>
-        <w:t>続けて **アニメーション**（表示順、動く方向、タイミング）を確認します。構造とアニメーションが問題なければ `OK` と返します。</w:t>
+        <w:t>Codex がアニメーション設定を自動検査し、「0〜1秒: タイトルを小さく拡大しながら表示」のような **日本語タイムライン**を示します。生の JSON を読む必要はありません。順番、強調、速さが問題なければ `OK` と返します。</w:t>
       </w:r>
     </w:p>
     <w:p>
       <w:pPr>
+        <w:keepNext/>
         <w:spacing w:after="80"/>
         <w:numPr>
           <w:ilvl w:val="0"/>
@@ -1325,6 +1471,7 @@
     </w:p>
     <w:p>
       <w:pPr>
+        <w:keepNext w:val="0"/>
         <w:spacing w:after="80"/>
         <w:numPr>
           <w:ilvl w:val="0"/>
@@ -1352,6 +1499,9 @@
         <w:gridCol w:w="9360"/>
       </w:tblGrid>
       <w:tr>
+        <w:trPr>
+          <w:cantSplit/>
+        </w:trPr>
         <w:tc>
           <w:tcPr>
             <w:tcW w:type="dxa" w:w="9360"/>
@@ -1432,6 +1582,7 @@
     <w:p>
       <w:pPr>
         <w:pStyle w:val="GuideCode"/>
+        <w:keepLines/>
         <w:ind w:left="259" w:right="259"/>
       </w:pPr>
       <w:r>
@@ -1446,11 +1597,14 @@
         <w:br/>
         <w:t>├── metadata.json</w:t>
         <w:br/>
+        <w:t>├── animation-summary.json</w:t>
+        <w:br/>
         <w:t>└── review-request.md</w:t>
       </w:r>
     </w:p>
     <w:p>
       <w:pPr>
+        <w:keepNext/>
         <w:spacing w:after="80"/>
         <w:numPr>
           <w:ilvl w:val="0"/>
@@ -1468,6 +1622,7 @@
     </w:p>
     <w:p>
       <w:pPr>
+        <w:keepNext/>
         <w:spacing w:after="80"/>
         <w:numPr>
           <w:ilvl w:val="0"/>
@@ -1485,6 +1640,7 @@
     </w:p>
     <w:p>
       <w:pPr>
+        <w:keepNext/>
         <w:spacing w:after="80"/>
         <w:numPr>
           <w:ilvl w:val="0"/>
@@ -1498,6 +1654,24 @@
           <w:sz w:val="22"/>
         </w:rPr>
         <w:t>`metadata.json` は共有時点のファイル情報です。通常は編集しません。</w:t>
+      </w:r>
+    </w:p>
+    <w:p>
+      <w:pPr>
+        <w:keepNext w:val="0"/>
+        <w:spacing w:after="80"/>
+        <w:numPr>
+          <w:ilvl w:val="0"/>
+          <w:numId w:val="94"/>
+        </w:numPr>
+      </w:pPr>
+      <w:r>
+        <w:rPr>
+          <w:rFonts w:ascii="Calibri" w:hAnsi="Calibri" w:eastAsia="Yu Gothic"/>
+          <w:color w:val="0B2545"/>
+          <w:sz w:val="22"/>
+        </w:rPr>
+        <w:t>`animation-summary.json` は、表示順、時間、使用した動きだけを記録します。台本、画像、表示文字は入りません。</w:t>
       </w:r>
     </w:p>
     <w:p>
@@ -1524,6 +1698,7 @@
     </w:p>
     <w:p>
       <w:pPr>
+        <w:keepNext/>
         <w:spacing w:after="80"/>
         <w:numPr>
           <w:ilvl w:val="0"/>
@@ -1541,6 +1716,7 @@
     </w:p>
     <w:p>
       <w:pPr>
+        <w:keepNext w:val="0"/>
         <w:spacing w:after="80"/>
         <w:numPr>
           <w:ilvl w:val="0"/>
@@ -1642,6 +1818,7 @@
     <w:p>
       <w:pPr>
         <w:pStyle w:val="GuideCode"/>
+        <w:keepLines/>
         <w:ind w:left="259" w:right="259"/>
       </w:pPr>
       <w:r>
@@ -1667,12 +1844,98 @@
           <w:color w:val="0B2545"/>
           <w:sz w:val="22"/>
         </w:rPr>
-        <w:t>メンバーは、動画の共有とレビュー待ちメモまでを担当します。オーナーが共有動画を確認し、必要と判断した内容だけを手動で候補または承認済みルールへ反映します。</w:t>
+        <w:t>メンバーは、動画の共有とレビュー待ちメモまでを担当します。学習は次の順で行います。</w:t>
+      </w:r>
+    </w:p>
+    <w:p>
+      <w:pPr>
+        <w:keepNext/>
+        <w:spacing w:after="80"/>
+        <w:numPr>
+          <w:ilvl w:val="0"/>
+          <w:numId w:val="96"/>
+        </w:numPr>
+      </w:pPr>
+      <w:r>
+        <w:rPr>
+          <w:rFonts w:ascii="Calibri" w:hAnsi="Calibri" w:eastAsia="Yu Gothic"/>
+          <w:color w:val="0B2545"/>
+          <w:sz w:val="22"/>
+        </w:rPr>
+        <w:t>メンバーが完成動画へ `OK` を返し、動画のドラフト PR を作成します。</w:t>
+      </w:r>
+    </w:p>
+    <w:p>
+      <w:pPr>
+        <w:keepNext/>
+        <w:spacing w:after="80"/>
+        <w:numPr>
+          <w:ilvl w:val="0"/>
+          <w:numId w:val="96"/>
+        </w:numPr>
+      </w:pPr>
+      <w:r>
+        <w:rPr>
+          <w:rFonts w:ascii="Calibri" w:hAnsi="Calibri" w:eastAsia="Yu Gothic"/>
+          <w:color w:val="0B2545"/>
+          <w:sz w:val="22"/>
+        </w:rPr>
+        <w:t>オーナーが動画、`review-request.md`、`animation-summary.json` を確認します。</w:t>
+      </w:r>
+    </w:p>
+    <w:p>
+      <w:pPr>
+        <w:keepNext/>
+        <w:spacing w:after="80"/>
+        <w:numPr>
+          <w:ilvl w:val="0"/>
+          <w:numId w:val="96"/>
+        </w:numPr>
+      </w:pPr>
+      <w:r>
+        <w:rPr>
+          <w:rFonts w:ascii="Calibri" w:hAnsi="Calibri" w:eastAsia="Yu Gothic"/>
+          <w:color w:val="0B2545"/>
+          <w:sz w:val="22"/>
+        </w:rPr>
+        <w:t>オーナーが動画を承認すると、Codex が再利用できそうな学習案を画面に提示します。この時点ではファイルを変更しません。</w:t>
+      </w:r>
+    </w:p>
+    <w:p>
+      <w:pPr>
+        <w:keepNext w:val="0"/>
+        <w:spacing w:after="80"/>
+        <w:numPr>
+          <w:ilvl w:val="0"/>
+          <w:numId w:val="96"/>
+        </w:numPr>
+      </w:pPr>
+      <w:r>
+        <w:rPr>
+          <w:rFonts w:ascii="Calibri" w:hAnsi="Calibri" w:eastAsia="Yu Gothic"/>
+          <w:color w:val="0B2545"/>
+          <w:sz w:val="22"/>
+        </w:rPr>
+        <w:t>オーナーが学習案を明示的に承認した場合だけ、Codex が `approved/` と `successes/` を更新します。公開前にも変更ファイルを表示し、オーナーの承認を受けます。</w:t>
+      </w:r>
+    </w:p>
+    <w:p>
+      <w:pPr>
+        <w:spacing w:after="120"/>
+      </w:pPr>
+      <w:r>
+        <w:rPr>
+          <w:rFonts w:ascii="Calibri" w:hAnsi="Calibri" w:eastAsia="Yu Gothic"/>
+          <w:color w:val="0B2545"/>
+          <w:sz w:val="22"/>
+        </w:rPr>
+        <w:t>これはモデル自体の追加学習ではありません。承認された文章ルールと成功記録を、次回の Codex が品質基準と参考例として読みます。</w:t>
       </w:r>
     </w:p>
     <w:p>
       <w:pPr>
         <w:pStyle w:val="Heading1"/>
+        <w:keepNext/>
       </w:pPr>
       <w:r>
         <w:t>8. 困ったとき</w:t>
@@ -1691,6 +1954,9 @@
         <w:gridCol w:w="6660"/>
       </w:tblGrid>
       <w:tr>
+        <w:trPr>
+          <w:cantSplit/>
+        </w:trPr>
         <w:tc>
           <w:tcPr>
             <w:tcW w:type="dxa" w:w="2700"/>
@@ -1704,6 +1970,9 @@
             <w:shd w:fill="E8EEF5"/>
           </w:tcPr>
           <w:p>
+            <w:pPr>
+              <w:keepNext/>
+            </w:pPr>
             <w:r>
               <w:rPr>
                 <w:rFonts w:ascii="Calibri" w:hAnsi="Calibri" w:eastAsia="Yu Gothic"/>
@@ -1728,6 +1997,9 @@
             <w:shd w:fill="E8EEF5"/>
           </w:tcPr>
           <w:p>
+            <w:pPr>
+              <w:keepNext/>
+            </w:pPr>
             <w:r>
               <w:rPr>
                 <w:rFonts w:ascii="Calibri" w:hAnsi="Calibri" w:eastAsia="Yu Gothic"/>
@@ -1741,12 +2013,16 @@
         </w:tc>
       </w:tr>
       <w:tr>
+        <w:trPr>
+          <w:cantSplit/>
+        </w:trPr>
         <w:tc>
           <w:tcPr>
             <w:tcW w:type="dxa" w:w="2700"/>
           </w:tcPr>
           <w:p>
             <w:pPr>
+              <w:keepNext/>
               <w:spacing w:after="0"/>
             </w:pPr>
             <w:r>
@@ -1765,6 +2041,7 @@
           </w:tcPr>
           <w:p>
             <w:pPr>
+              <w:keepNext/>
               <w:spacing w:after="0"/>
             </w:pPr>
             <w:r>
@@ -1779,12 +2056,16 @@
         </w:tc>
       </w:tr>
       <w:tr>
+        <w:trPr>
+          <w:cantSplit/>
+        </w:trPr>
         <w:tc>
           <w:tcPr>
             <w:tcW w:type="dxa" w:w="2700"/>
           </w:tcPr>
           <w:p>
             <w:pPr>
+              <w:keepNext/>
               <w:spacing w:after="0"/>
             </w:pPr>
             <w:r>
@@ -1803,6 +2084,7 @@
           </w:tcPr>
           <w:p>
             <w:pPr>
+              <w:keepNext/>
               <w:spacing w:after="0"/>
             </w:pPr>
             <w:r>
@@ -1817,12 +2099,16 @@
         </w:tc>
       </w:tr>
       <w:tr>
+        <w:trPr>
+          <w:cantSplit/>
+        </w:trPr>
         <w:tc>
           <w:tcPr>
             <w:tcW w:type="dxa" w:w="2700"/>
           </w:tcPr>
           <w:p>
             <w:pPr>
+              <w:keepNext/>
               <w:spacing w:after="0"/>
             </w:pPr>
             <w:r>
@@ -1841,6 +2127,7 @@
           </w:tcPr>
           <w:p>
             <w:pPr>
+              <w:keepNext/>
               <w:spacing w:after="0"/>
             </w:pPr>
             <w:r>
@@ -1855,12 +2142,16 @@
         </w:tc>
       </w:tr>
       <w:tr>
+        <w:trPr>
+          <w:cantSplit/>
+        </w:trPr>
         <w:tc>
           <w:tcPr>
             <w:tcW w:type="dxa" w:w="2700"/>
           </w:tcPr>
           <w:p>
             <w:pPr>
+              <w:keepNext/>
               <w:spacing w:after="0"/>
             </w:pPr>
             <w:r>
@@ -1879,6 +2170,7 @@
           </w:tcPr>
           <w:p>
             <w:pPr>
+              <w:keepNext/>
               <w:spacing w:after="0"/>
             </w:pPr>
             <w:r>
@@ -1893,12 +2185,59 @@
         </w:tc>
       </w:tr>
       <w:tr>
+        <w:trPr>
+          <w:cantSplit/>
+        </w:trPr>
         <w:tc>
           <w:tcPr>
             <w:tcW w:type="dxa" w:w="2700"/>
           </w:tcPr>
           <w:p>
             <w:pPr>
+              <w:keepNext/>
+              <w:spacing w:after="0"/>
+            </w:pPr>
+            <w:r>
+              <w:rPr>
+                <w:rFonts w:ascii="Calibri" w:hAnsi="Calibri" w:eastAsia="Yu Gothic"/>
+                <w:color w:val="0B2545"/>
+                <w:sz w:val="19"/>
+              </w:rPr>
+              <w:t>アニメーション検査で止まった</w:t>
+            </w:r>
+          </w:p>
+        </w:tc>
+        <w:tc>
+          <w:tcPr>
+            <w:tcW w:type="dxa" w:w="6660"/>
+          </w:tcPr>
+          <w:p>
+            <w:pPr>
+              <w:keepNext/>
+              <w:spacing w:after="0"/>
+            </w:pPr>
+            <w:r>
+              <w:rPr>
+                <w:rFonts w:ascii="Calibri" w:hAnsi="Calibri" w:eastAsia="Yu Gothic"/>
+                <w:color w:val="0B2545"/>
+                <w:sz w:val="19"/>
+              </w:rPr>
+              <w:t>Codex に表示されたエラーをそのまま渡します。要素、時間、曲線経路、安全範囲を Codex が修正して再検査します。</w:t>
+            </w:r>
+          </w:p>
+        </w:tc>
+      </w:tr>
+      <w:tr>
+        <w:trPr>
+          <w:cantSplit/>
+        </w:trPr>
+        <w:tc>
+          <w:tcPr>
+            <w:tcW w:type="dxa" w:w="2700"/>
+          </w:tcPr>
+          <w:p>
+            <w:pPr>
+              <w:keepNext/>
               <w:spacing w:after="0"/>
             </w:pPr>
             <w:r>
@@ -1917,6 +2256,7 @@
           </w:tcPr>
           <w:p>
             <w:pPr>
+              <w:keepNext/>
               <w:spacing w:after="0"/>
             </w:pPr>
             <w:r>
@@ -1931,6 +2271,9 @@
         </w:tc>
       </w:tr>
       <w:tr>
+        <w:trPr>
+          <w:cantSplit/>
+        </w:trPr>
         <w:tc>
           <w:tcPr>
             <w:tcW w:type="dxa" w:w="2700"/>
@@ -1985,7 +2328,7 @@
     </w:p>
     <w:p>
       <w:pPr>
-        <w:spacing w:after="80"/>
+        <w:spacing w:after="40"/>
         <w:ind w:left="540" w:hanging="274"/>
       </w:pPr>
       <w:r>
@@ -2008,7 +2351,7 @@
     </w:p>
     <w:p>
       <w:pPr>
-        <w:spacing w:after="80"/>
+        <w:spacing w:after="40"/>
         <w:ind w:left="540" w:hanging="274"/>
       </w:pPr>
       <w:r>
@@ -2031,7 +2374,7 @@
     </w:p>
     <w:p>
       <w:pPr>
-        <w:spacing w:after="80"/>
+        <w:spacing w:after="40"/>
         <w:ind w:left="540" w:hanging="274"/>
       </w:pPr>
       <w:r>
@@ -2049,12 +2392,12 @@
           <w:color w:val="0B2545"/>
           <w:sz w:val="22"/>
         </w:rPr>
-        <w:t>`$movie-create` で画像・構造・アニメーションを確認し、必要な段階で `OK` を返した</w:t>
+        <w:t>`$movie-create` で画像・構造・日本語タイムラインを確認し、必要な段階で `OK` を返した</w:t>
       </w:r>
     </w:p>
     <w:p>
       <w:pPr>
-        <w:spacing w:after="80"/>
+        <w:spacing w:after="40"/>
         <w:ind w:left="540" w:hanging="274"/>
       </w:pPr>
       <w:r>
@@ -2077,7 +2420,7 @@
     </w:p>
     <w:p>
       <w:pPr>
-        <w:spacing w:after="80"/>
+        <w:spacing w:after="40"/>
         <w:ind w:left="540" w:hanging="274"/>
       </w:pPr>
       <w:r>
@@ -2095,12 +2438,12 @@
           <w:color w:val="0B2545"/>
           <w:sz w:val="22"/>
         </w:rPr>
-        <w:t>`shared-videos/&lt;project-id&gt;/` だけが自動で共有された</w:t>
+        <w:t>`shared-videos/&lt;project-id&gt;/` に MP4、メタデータ、アニメーション要約、確認メモだけが自動共有された</w:t>
       </w:r>
     </w:p>
     <w:p>
       <w:pPr>
-        <w:spacing w:after="80"/>
+        <w:spacing w:after="40"/>
         <w:ind w:left="540" w:hanging="274"/>
       </w:pPr>
       <w:r>
@@ -2123,7 +2466,7 @@
     </w:p>
     <w:p>
       <w:pPr>
-        <w:spacing w:after="80"/>
+        <w:spacing w:after="40"/>
         <w:ind w:left="540" w:hanging="274"/>
       </w:pPr>
       <w:r>
@@ -2146,7 +2489,7 @@
     </w:p>
     <w:p>
       <w:pPr>
-        <w:spacing w:after="80"/>
+        <w:spacing w:after="40"/>
         <w:ind w:left="540" w:hanging="274"/>
       </w:pPr>
       <w:r>
@@ -2178,10 +2521,11 @@
     </w:p>
     <w:p>
       <w:pPr>
+        <w:keepNext/>
         <w:spacing w:after="80"/>
         <w:numPr>
           <w:ilvl w:val="0"/>
-          <w:numId w:val="96"/>
+          <w:numId w:val="97"/>
         </w:numPr>
       </w:pPr>
       <w:r>
@@ -2195,10 +2539,11 @@
     </w:p>
     <w:p>
       <w:pPr>
+        <w:keepNext w:val="0"/>
         <w:spacing w:after="80"/>
         <w:numPr>
           <w:ilvl w:val="0"/>
-          <w:numId w:val="96"/>
+          <w:numId w:val="97"/>
         </w:numPr>
       </w:pPr>
       <w:r>
@@ -2555,6 +2900,24 @@
     <w:multiLevelType w:val="singleLevel"/>
     <w:lvl w:ilvl="0">
       <w:start w:val="1"/>
+      <w:numFmt w:val="decimal"/>
+      <w:lvlText w:val="%1."/>
+      <w:lvlJc w:val="left"/>
+      <w:pPr>
+        <w:tabs>
+          <w:tab w:val="num" w:pos="540"/>
+        </w:tabs>
+        <w:ind w:left="540" w:hanging="270"/>
+      </w:pPr>
+    </w:lvl>
+  </w:abstractNum>
+  <w:num w:numId="96">
+    <w:abstractNumId w:val="96"/>
+  </w:num>
+  <w:abstractNum w:abstractNumId="97">
+    <w:multiLevelType w:val="singleLevel"/>
+    <w:lvl w:ilvl="0">
+      <w:start w:val="1"/>
       <w:numFmt w:val="bullet"/>
       <w:lvlText w:val="•"/>
       <w:lvlJc w:val="left"/>
@@ -2566,8 +2929,8 @@
       </w:pPr>
     </w:lvl>
   </w:abstractNum>
-  <w:num w:numId="96">
-    <w:abstractNumId w:val="96"/>
+  <w:num w:numId="97">
+    <w:abstractNumId w:val="97"/>
   </w:num>
 </w:numbering>
 </file>

</xml_diff>